<commit_message>
Actividades de la unidad 5
</commit_message>
<xml_diff>
--- a/Actividad 5.1 Mapa conceptual_AlanRodríguez_ABD_6ISCM.docx
+++ b/Actividad 5.1 Mapa conceptual_AlanRodríguez_ABD_6ISCM.docx
@@ -877,7 +877,7 @@
           <w:sz w:val="30"/>
           <w:szCs w:val="30"/>
         </w:rPr>
-        <w:t>27</w:t>
+        <w:t>04</w:t>
       </w:r>
       <w:r>
         <w:rPr>
@@ -901,7 +901,15 @@
           <w:sz w:val="30"/>
           <w:szCs w:val="30"/>
         </w:rPr>
-        <w:t>mayo</w:t>
+        <w:t>juni</w:t>
+      </w:r>
+      <w:r>
+        <w:rPr>
+          <w:b/>
+          <w:sz w:val="30"/>
+          <w:szCs w:val="30"/>
+        </w:rPr>
+        <w:t>o</w:t>
       </w:r>
       <w:r>
         <w:rPr>
@@ -1203,7 +1211,7 @@
           <w:sz w:val="24"/>
           <w:szCs w:val="18"/>
         </w:rPr>
-        <w:t>La seguridad en bases de datos se refiere al conjunto de técnicas, procesos y herramientas que permiten proteger la información almacenada dentro de un Sistema Gestor de Base de Datos. Su finalidad principal es evitar la pérdida, alteración o acceso no autorizado a los datos, garantizando que la información se mantenga disponible, íntegra y confiable para los usuarios y las organizaciones.</w:t>
+        <w:t xml:space="preserve">La seguridad en bases de datos se refiere al conjunto de técnicas, procesos y herramientas que permiten proteger la información almacenada dentro de un Sistema Gestor de Base de Datos. </w:t>
       </w:r>
     </w:p>
     <w:p>
@@ -1239,7 +1247,7 @@
           <w:sz w:val="24"/>
           <w:szCs w:val="18"/>
         </w:rPr>
-        <w:t>Este tema es de gran importancia, ya que actualmente muchas instituciones, empresas y sistemas dependen del manejo correcto de la información. Por ello, se utilizan diferentes métodos como el espejeo, la réplica, los respaldos y la recuperación de datos, los cuales ayudan a prevenir daños ante fallas del sistema, errores humanos, ataques informáticos o problemas técnicos que puedan afectar el funcionamiento de la base de datos.</w:t>
+        <w:t>Su finalidad principal es evitar la pérdida, alteración o acceso no autorizado a los datos, garantizando que la información se mantenga disponible, íntegra y confiable para los usuarios y las organizaciones.</w:t>
       </w:r>
     </w:p>
     <w:p>
@@ -1275,7 +1283,103 @@
           <w:sz w:val="24"/>
           <w:szCs w:val="18"/>
         </w:rPr>
-        <w:t>Por lo tanto, en esta actividad se realizará un mapa conceptual sobre la seguridad en bases de datos, integrando los temas de espejeo, réplica, métodos de respaldo, métodos de recuperación y migración de bases de datos. Esto permitirá comprender de manera más clara cómo se protege, conserva y traslada la información dentro de un SGBD, así como la importancia de aplicar estas técnicas para mantener la continuidad y confiabilidad de los datos.</w:t>
+        <w:t>P</w:t>
+      </w:r>
+      <w:r>
+        <w:rPr>
+          <w:bCs/>
+          <w:sz w:val="24"/>
+          <w:szCs w:val="18"/>
+        </w:rPr>
+        <w:t xml:space="preserve">ara comprender mejor </w:t>
+      </w:r>
+      <w:r>
+        <w:rPr>
+          <w:bCs/>
+          <w:sz w:val="24"/>
+          <w:szCs w:val="18"/>
+        </w:rPr>
+        <w:t>conocer cómo podemos mantener segura una base de datos</w:t>
+      </w:r>
+      <w:r>
+        <w:rPr>
+          <w:bCs/>
+          <w:sz w:val="24"/>
+          <w:szCs w:val="18"/>
+        </w:rPr>
+        <w:t xml:space="preserve">, exploraremos a continuación diversos conceptos y técnicas, tales como el </w:t>
+      </w:r>
+      <w:r>
+        <w:rPr>
+          <w:bCs/>
+          <w:sz w:val="24"/>
+          <w:szCs w:val="18"/>
+        </w:rPr>
+        <w:t xml:space="preserve">espejeo, </w:t>
+      </w:r>
+      <w:r>
+        <w:rPr>
+          <w:bCs/>
+          <w:sz w:val="24"/>
+          <w:szCs w:val="18"/>
+        </w:rPr>
+        <w:t xml:space="preserve">la </w:t>
+      </w:r>
+      <w:r>
+        <w:rPr>
+          <w:bCs/>
+          <w:sz w:val="24"/>
+          <w:szCs w:val="18"/>
+        </w:rPr>
+        <w:t xml:space="preserve">réplica, </w:t>
+      </w:r>
+      <w:r>
+        <w:rPr>
+          <w:bCs/>
+          <w:sz w:val="24"/>
+          <w:szCs w:val="18"/>
+        </w:rPr>
+        <w:t xml:space="preserve">los </w:t>
+      </w:r>
+      <w:r>
+        <w:rPr>
+          <w:bCs/>
+          <w:sz w:val="24"/>
+          <w:szCs w:val="18"/>
+        </w:rPr>
+        <w:t xml:space="preserve">métodos de respaldo, </w:t>
+      </w:r>
+      <w:r>
+        <w:rPr>
+          <w:bCs/>
+          <w:sz w:val="24"/>
+          <w:szCs w:val="18"/>
+        </w:rPr>
+        <w:t xml:space="preserve">los </w:t>
+      </w:r>
+      <w:r>
+        <w:rPr>
+          <w:bCs/>
+          <w:sz w:val="24"/>
+          <w:szCs w:val="18"/>
+        </w:rPr>
+        <w:t xml:space="preserve">métodos de recuperación y </w:t>
+      </w:r>
+      <w:r>
+        <w:rPr>
+          <w:bCs/>
+          <w:sz w:val="24"/>
+          <w:szCs w:val="18"/>
+        </w:rPr>
+        <w:t xml:space="preserve">la </w:t>
+      </w:r>
+      <w:r>
+        <w:rPr>
+          <w:bCs/>
+          <w:sz w:val="24"/>
+          <w:szCs w:val="18"/>
+        </w:rPr>
+        <w:t xml:space="preserve">migración de bases de datos. </w:t>
       </w:r>
     </w:p>
     <w:p>
@@ -1295,9 +1399,6 @@
     <w:p>
       <w:pPr>
         <w:pStyle w:val="Sinespaciado"/>
-        <w:tabs>
-          <w:tab w:val="left" w:pos="6090"/>
-        </w:tabs>
         <w:jc w:val="both"/>
         <w:rPr>
           <w:bCs/>
@@ -1331,17 +1432,6 @@
     <w:p>
       <w:pPr>
         <w:pStyle w:val="Sinespaciado"/>
-        <w:jc w:val="both"/>
-        <w:rPr>
-          <w:bCs/>
-          <w:sz w:val="24"/>
-          <w:szCs w:val="18"/>
-        </w:rPr>
-      </w:pPr>
-    </w:p>
-    <w:p>
-      <w:pPr>
-        <w:pStyle w:val="Sinespaciado"/>
         <w:jc w:val="center"/>
         <w:rPr>
           <w:b/>
@@ -1453,6 +1543,86 @@
       <w:pPr>
         <w:pStyle w:val="Sinespaciado"/>
         <w:jc w:val="center"/>
+        <w:rPr>
+          <w:b/>
+          <w:sz w:val="24"/>
+          <w:szCs w:val="18"/>
+        </w:rPr>
+      </w:pPr>
+    </w:p>
+    <w:p>
+      <w:pPr>
+        <w:pStyle w:val="Sinespaciado"/>
+        <w:rPr>
+          <w:b/>
+          <w:sz w:val="24"/>
+          <w:szCs w:val="18"/>
+        </w:rPr>
+      </w:pPr>
+    </w:p>
+    <w:p>
+      <w:pPr>
+        <w:pStyle w:val="Sinespaciado"/>
+        <w:rPr>
+          <w:b/>
+          <w:sz w:val="24"/>
+          <w:szCs w:val="18"/>
+        </w:rPr>
+      </w:pPr>
+    </w:p>
+    <w:p>
+      <w:pPr>
+        <w:pStyle w:val="Sinespaciado"/>
+        <w:rPr>
+          <w:b/>
+          <w:sz w:val="24"/>
+          <w:szCs w:val="18"/>
+        </w:rPr>
+      </w:pPr>
+    </w:p>
+    <w:p>
+      <w:pPr>
+        <w:pStyle w:val="Sinespaciado"/>
+        <w:rPr>
+          <w:b/>
+          <w:sz w:val="24"/>
+          <w:szCs w:val="18"/>
+        </w:rPr>
+      </w:pPr>
+    </w:p>
+    <w:p>
+      <w:pPr>
+        <w:pStyle w:val="Sinespaciado"/>
+        <w:rPr>
+          <w:b/>
+          <w:sz w:val="24"/>
+          <w:szCs w:val="18"/>
+        </w:rPr>
+      </w:pPr>
+    </w:p>
+    <w:p>
+      <w:pPr>
+        <w:pStyle w:val="Sinespaciado"/>
+        <w:rPr>
+          <w:b/>
+          <w:sz w:val="24"/>
+          <w:szCs w:val="18"/>
+        </w:rPr>
+      </w:pPr>
+    </w:p>
+    <w:p>
+      <w:pPr>
+        <w:pStyle w:val="Sinespaciado"/>
+        <w:rPr>
+          <w:b/>
+          <w:sz w:val="24"/>
+          <w:szCs w:val="18"/>
+        </w:rPr>
+      </w:pPr>
+    </w:p>
+    <w:p>
+      <w:pPr>
+        <w:pStyle w:val="Sinespaciado"/>
         <w:rPr>
           <w:b/>
           <w:sz w:val="24"/>
@@ -1832,7 +2002,7 @@
           <w:sz w:val="24"/>
           <w:szCs w:val="18"/>
         </w:rPr>
-        <w:t>La seguridad en bases de datos es un tema de gran importancia, ya que actualmente la información es uno de los recursos más valiosos dentro de cualquier institución, empresa o sistema informático. Proteger los datos permite evitar pérdidas, daños, accesos no autorizados o fallas que puedan afectar el funcionamiento de una organización. Por esta razón, es necesario conocer las técnicas que ayudan a mantener la información segura, disponible y confiable.</w:t>
+        <w:t xml:space="preserve">La seguridad en bases de datos es un tema de gran importancia, ya que actualmente la información es uno de los recursos más valiosos dentro de cualquier institución, empresa o sistema informático. </w:t>
       </w:r>
     </w:p>
     <w:p>
@@ -1860,7 +2030,7 @@
           <w:sz w:val="24"/>
           <w:szCs w:val="18"/>
         </w:rPr>
-        <w:t>Por lo cual, considero que esta actividad es importante, ya que nos permitirá comprender de mejor manera los principales métodos que se utilizan para proteger y conservar una base de datos. A través del análisis del espejeo, la réplica, los respaldos, la recuperación y la migración, podremos identificar cómo cada uno de estos procesos contribuye a prevenir problemas y a garantizar la continuidad de la información dentro de un SGBD.</w:t>
+        <w:t>Proteger los datos permite evitar pérdidas, daños, accesos no autorizados o fallas que puedan afectar el funcionamiento de una organización. Por esta razón, es necesario conocer las técnicas que ayudan a mantener la información segura, disponible y confiable.</w:t>
       </w:r>
     </w:p>
     <w:p>
@@ -1888,35 +2058,30 @@
           <w:sz w:val="24"/>
           <w:szCs w:val="18"/>
         </w:rPr>
-        <w:t>Además, realizar un mapa conceptual sobre este tema facilita la organización de las ideas principales y permite visualizar de forma clara la relación entre cada concepto. De esta manera, la actividad no solo ayuda a reforzar el aprendizaje teórico, sino también a comprender la importancia de aplicar buenas prácticas de seguridad para evitar la pérdida de datos y mejorar la administración de una base de datos.</w:t>
-      </w:r>
-    </w:p>
-    <w:p>
-      <w:pPr>
-        <w:pStyle w:val="Sinespaciado"/>
-        <w:rPr>
-          <w:b/>
-          <w:sz w:val="24"/>
-          <w:szCs w:val="18"/>
-        </w:rPr>
-      </w:pPr>
-    </w:p>
-    <w:p>
-      <w:pPr>
-        <w:pStyle w:val="Sinespaciado"/>
-        <w:rPr>
-          <w:b/>
-          <w:sz w:val="24"/>
-          <w:szCs w:val="18"/>
-        </w:rPr>
-      </w:pPr>
-    </w:p>
-    <w:p>
-      <w:pPr>
-        <w:pStyle w:val="Sinespaciado"/>
-        <w:jc w:val="center"/>
-        <w:rPr>
-          <w:b/>
+        <w:t xml:space="preserve">Por </w:t>
+      </w:r>
+      <w:r>
+        <w:rPr>
+          <w:bCs/>
+          <w:sz w:val="24"/>
+          <w:szCs w:val="18"/>
+        </w:rPr>
+        <w:t>ello</w:t>
+      </w:r>
+      <w:r>
+        <w:rPr>
+          <w:bCs/>
+          <w:sz w:val="24"/>
+          <w:szCs w:val="18"/>
+        </w:rPr>
+        <w:t xml:space="preserve">, considero que esta actividad es importante, ya que nos permitirá comprender de mejor manera los principales métodos que se utilizan para proteger y conservar una base de datos. </w:t>
+      </w:r>
+    </w:p>
+    <w:p>
+      <w:pPr>
+        <w:jc w:val="both"/>
+        <w:rPr>
+          <w:bCs/>
           <w:sz w:val="24"/>
           <w:szCs w:val="18"/>
         </w:rPr>
@@ -2543,8 +2708,19 @@
                                 <w:sz w:val="20"/>
                                 <w:szCs w:val="20"/>
                               </w:rPr>
-                              <w:t xml:space="preserve"> realizado en la plataforma Canva</w:t>
+                              <w:t xml:space="preserve"> realizado en la plataforma </w:t>
                             </w:r>
+                            <w:proofErr w:type="spellStart"/>
+                            <w:r>
+                              <w:rPr>
+                                <w:b/>
+                                <w:bCs/>
+                                <w:sz w:val="20"/>
+                                <w:szCs w:val="20"/>
+                              </w:rPr>
+                              <w:t>Canva</w:t>
+                            </w:r>
+                            <w:proofErr w:type="spellEnd"/>
                             <w:r>
                               <w:rPr>
                                 <w:b/>
@@ -2746,8 +2922,19 @@
                           <w:sz w:val="20"/>
                           <w:szCs w:val="20"/>
                         </w:rPr>
-                        <w:t xml:space="preserve"> realizado en la plataforma Canva</w:t>
+                        <w:t xml:space="preserve"> realizado en la plataforma </w:t>
                       </w:r>
+                      <w:proofErr w:type="spellStart"/>
+                      <w:r>
+                        <w:rPr>
+                          <w:b/>
+                          <w:bCs/>
+                          <w:sz w:val="20"/>
+                          <w:szCs w:val="20"/>
+                        </w:rPr>
+                        <w:t>Canva</w:t>
+                      </w:r>
+                      <w:proofErr w:type="spellEnd"/>
                       <w:r>
                         <w:rPr>
                           <w:b/>
@@ -3143,7 +3330,14 @@
           <w:sz w:val="24"/>
           <w:szCs w:val="18"/>
         </w:rPr>
-        <w:t>En conclusión, la seguridad en bases de datos es un tema muy importante, ya que permite proteger la información contra pérdidas, daños, errores o accesos no autorizados. Actualmente, los datos son fundamentales para el funcionamiento de empresas, instituciones y sistemas, por lo que es necesario aplicar métodos que ayuden a mantenerlos seguros, disponibles y confiables en todo momento.</w:t>
+        <w:t xml:space="preserve">A través de esta actividad, pude comprender que </w:t>
+      </w:r>
+      <w:r>
+        <w:rPr>
+          <w:sz w:val="24"/>
+          <w:szCs w:val="18"/>
+        </w:rPr>
+        <w:t>los datos son fundamentales para el funcionamiento de empresas, instituciones y sistemas, por lo que es necesario aplicar métodos que ayuden a mantenerlos seguros, disponibles y confiables en todo momento.</w:t>
       </w:r>
     </w:p>
     <w:p>
@@ -3170,7 +3364,14 @@
           <w:sz w:val="24"/>
           <w:szCs w:val="18"/>
         </w:rPr>
-        <w:t>A través de esta actividad pude comprender que existen diferentes técnicas para cuidar una base de datos, como el espejeo, la réplica, los métodos de respaldo, los métodos de recuperación y la migración. Cada uno de estos procesos cumple una función importante, ya sea para crear copias de seguridad, recuperar información después de una falla, mantener la disponibilidad del sistema o trasladar datos de un lugar a otro sin perder información.</w:t>
+        <w:t>Así mismo, a</w:t>
+      </w:r>
+      <w:r>
+        <w:rPr>
+          <w:sz w:val="24"/>
+          <w:szCs w:val="18"/>
+        </w:rPr>
+        <w:t xml:space="preserve"> través de esta actividad pude comprender que existen diferentes técnicas para cuidar una base de datos, como el espejeo, la réplica, los métodos de respaldo, los métodos de recuperación y la migración. Cada uno de estos procesos cumple una función importante, ya sea para crear copias de seguridad, recuperar información después de una falla, mantener la disponibilidad del sistema o trasladar datos de un lugar a otro sin perder información.</w:t>
       </w:r>
     </w:p>
     <w:p>
@@ -3191,46 +3392,61 @@
           <w:sz w:val="24"/>
           <w:szCs w:val="18"/>
         </w:rPr>
-        <w:sectPr>
-          <w:type w:val="continuous"/>
-          <w:pgSz w:w="12240" w:h="15840"/>
-          <w:pgMar w:top="1418" w:right="1701" w:bottom="1418" w:left="1701" w:header="720" w:footer="720" w:gutter="0"/>
-          <w:cols w:space="720"/>
-          <w:docGrid w:linePitch="299"/>
-        </w:sectPr>
-      </w:pPr>
-      <w:r>
-        <w:rPr>
-          <w:sz w:val="24"/>
-          <w:szCs w:val="18"/>
-        </w:rPr>
-        <w:t>Finalmente, la elaboración del mapa conceptual permitió organizar mejor las ideas principales del tema y entender la relación que existe entre cada concepto. Esto me ayudó a reconocer que la seguridad en un SGBD no solo consiste en proteger los datos, sino también en garantizar que puedan recuperarse y mantenerse disponibles cuando sea necesario.</w:t>
-      </w:r>
-    </w:p>
-    <w:p>
-      <w:pPr>
-        <w:pStyle w:val="Sinespaciado"/>
-        <w:rPr>
-          <w:sz w:val="24"/>
-          <w:szCs w:val="18"/>
-        </w:rPr>
-      </w:pPr>
-    </w:p>
-    <w:p>
-      <w:pPr>
-        <w:pStyle w:val="Sinespaciado"/>
-        <w:rPr>
-          <w:sz w:val="24"/>
-          <w:szCs w:val="18"/>
-        </w:rPr>
-      </w:pPr>
-    </w:p>
-    <w:p>
-      <w:pPr>
-        <w:pStyle w:val="Sinespaciado"/>
-        <w:rPr>
-          <w:sz w:val="24"/>
-          <w:szCs w:val="18"/>
+      </w:pPr>
+      <w:r>
+        <w:rPr>
+          <w:sz w:val="24"/>
+          <w:szCs w:val="18"/>
+        </w:rPr>
+        <w:t>Por lo tanto, pued</w:t>
+      </w:r>
+      <w:r>
+        <w:rPr>
+          <w:sz w:val="24"/>
+          <w:szCs w:val="18"/>
+        </w:rPr>
+        <w:t>o concluir que la seguridad en bases de datos es un tema muy importante, ya que permite proteger la información contra pérdidas, daños, errores o accesos no autorizados.</w:t>
+      </w:r>
+    </w:p>
+    <w:p>
+      <w:pPr>
+        <w:pStyle w:val="Sinespaciado"/>
+        <w:jc w:val="both"/>
+        <w:rPr>
+          <w:sz w:val="24"/>
+          <w:szCs w:val="18"/>
+        </w:rPr>
+      </w:pPr>
+    </w:p>
+    <w:p>
+      <w:pPr>
+        <w:pStyle w:val="Sinespaciado"/>
+        <w:rPr>
+          <w:sz w:val="32"/>
+        </w:rPr>
+      </w:pPr>
+    </w:p>
+    <w:p>
+      <w:pPr>
+        <w:pStyle w:val="Sinespaciado"/>
+        <w:rPr>
+          <w:sz w:val="32"/>
+        </w:rPr>
+      </w:pPr>
+    </w:p>
+    <w:p>
+      <w:pPr>
+        <w:pStyle w:val="Sinespaciado"/>
+        <w:rPr>
+          <w:sz w:val="32"/>
+        </w:rPr>
+      </w:pPr>
+    </w:p>
+    <w:p>
+      <w:pPr>
+        <w:pStyle w:val="Sinespaciado"/>
+        <w:rPr>
+          <w:sz w:val="32"/>
         </w:rPr>
       </w:pPr>
     </w:p>
@@ -3619,7 +3835,33 @@
           <w:szCs w:val="24"/>
           <w:lang w:val="es-MX" w:eastAsia="es-MX"/>
         </w:rPr>
-        <w:t>5.2 Réplica (replication)</w:t>
+        <w:t>5.2 Réplica (</w:t>
+      </w:r>
+      <w:proofErr w:type="spellStart"/>
+      <w:r>
+        <w:rPr>
+          <w:rFonts w:ascii="Georgia" w:eastAsia="Times New Roman" w:hAnsi="Georgia" w:cs="Helvetica"/>
+          <w:i/>
+          <w:iCs/>
+          <w:color w:val="000000"/>
+          <w:sz w:val="24"/>
+          <w:szCs w:val="24"/>
+          <w:lang w:val="es-MX" w:eastAsia="es-MX"/>
+        </w:rPr>
+        <w:t>replication</w:t>
+      </w:r>
+      <w:proofErr w:type="spellEnd"/>
+      <w:r>
+        <w:rPr>
+          <w:rFonts w:ascii="Georgia" w:eastAsia="Times New Roman" w:hAnsi="Georgia" w:cs="Helvetica"/>
+          <w:i/>
+          <w:iCs/>
+          <w:color w:val="000000"/>
+          <w:sz w:val="24"/>
+          <w:szCs w:val="24"/>
+          <w:lang w:val="es-MX" w:eastAsia="es-MX"/>
+        </w:rPr>
+        <w:t>)</w:t>
       </w:r>
       <w:r>
         <w:rPr>
@@ -3723,6 +3965,7 @@
           <w:lang w:val="es-MX" w:eastAsia="es-MX"/>
         </w:rPr>
       </w:pPr>
+      <w:proofErr w:type="spellStart"/>
       <w:r>
         <w:rPr>
           <w:rFonts w:ascii="Georgia" w:eastAsia="Times New Roman" w:hAnsi="Georgia" w:cs="Helvetica"/>
@@ -3731,7 +3974,18 @@
           <w:szCs w:val="24"/>
           <w:lang w:val="es-MX" w:eastAsia="es-MX"/>
         </w:rPr>
-        <w:t>Guzman, D. (2021, agosto 7). 5.4 Métodos de recuperación de un SGBD. </w:t>
+        <w:t>Guzman</w:t>
+      </w:r>
+      <w:proofErr w:type="spellEnd"/>
+      <w:r>
+        <w:rPr>
+          <w:rFonts w:ascii="Georgia" w:eastAsia="Times New Roman" w:hAnsi="Georgia" w:cs="Helvetica"/>
+          <w:color w:val="000000"/>
+          <w:sz w:val="24"/>
+          <w:szCs w:val="24"/>
+          <w:lang w:val="es-MX" w:eastAsia="es-MX"/>
+        </w:rPr>
+        <w:t>, D. (2021, agosto 7). 5.4 Métodos de recuperación de un SGBD. </w:t>
       </w:r>
       <w:r>
         <w:rPr>

</xml_diff>